<commit_message>
MOD pdf y doc
</commit_message>
<xml_diff>
--- a/Digitalizacion/RodrigoHernandezSanchez_DigitAct1.docx
+++ b/Digitalizacion/RodrigoHernandezSanchez_DigitAct1.docx
@@ -133,6 +133,7 @@
                                     <w:dataBinding w:prefixMappings="xmlns:ns0='http://purl.org/dc/elements/1.1/' xmlns:ns1='http://schemas.openxmlformats.org/package/2006/metadata/core-properties' " w:xpath="/ns1:coreProperties[1]/ns0:creator[1]" w:storeItemID="{6C3C8BC8-F283-45AE-878A-BAB7291924A1}"/>
                                     <w:text/>
                                   </w:sdtPr>
+                                  <w:sdtEndPr/>
                                   <w:sdtContent>
                                     <w:p>
                                       <w:pPr>
@@ -173,6 +174,7 @@
                                       <w:dataBinding w:prefixMappings="xmlns:ns0='http://schemas.openxmlformats.org/officeDocument/2006/extended-properties' " w:xpath="/ns0:Properties[1]/ns0:Company[1]" w:storeItemID="{6668398D-A668-4E3E-A5EB-62B293D839F1}"/>
                                       <w:text/>
                                     </w:sdtPr>
+                                    <w:sdtEndPr/>
                                     <w:sdtContent>
                                       <w:r>
                                         <w:rPr>
@@ -200,6 +202,7 @@
                                       <w:dataBinding w:prefixMappings="xmlns:ns0='http://schemas.microsoft.com/office/2006/coverPageProps' " w:xpath="/ns0:CoverPageProperties[1]/ns0:CompanyAddress[1]" w:storeItemID="{55AF091B-3C7A-41E3-B477-F2FDAA23CFDA}"/>
                                       <w:text/>
                                     </w:sdtPr>
+                                    <w:sdtEndPr/>
                                     <w:sdtContent>
                                       <w:r>
                                         <w:rPr>
@@ -279,19 +282,7 @@
                                       <w:szCs w:val="48"/>
                                       <w:shd w:val="clear" w:color="auto" w:fill="FFFFFF"/>
                                     </w:rPr>
-                                    <w:t xml:space="preserve">Actividad </w:t>
-                                  </w:r>
-                                  <w:r>
-                                    <w:rPr>
-                                      <w:rFonts w:ascii="Segoe UI" w:hAnsi="Segoe UI" w:cs="Segoe UI"/>
-                                      <w:b/>
-                                      <w:bCs/>
-                                      <w:color w:val="F2891E"/>
-                                      <w:sz w:val="48"/>
-                                      <w:szCs w:val="48"/>
-                                      <w:shd w:val="clear" w:color="auto" w:fill="FFFFFF"/>
-                                    </w:rPr>
-                                    <w:t>Industria 1.0</w:t>
+                                    <w:t>Actividad Industria 1.0</w:t>
                                   </w:r>
                                 </w:p>
                               </w:txbxContent>
@@ -333,6 +324,7 @@
                               <w:dataBinding w:prefixMappings="xmlns:ns0='http://purl.org/dc/elements/1.1/' xmlns:ns1='http://schemas.openxmlformats.org/package/2006/metadata/core-properties' " w:xpath="/ns1:coreProperties[1]/ns0:creator[1]" w:storeItemID="{6C3C8BC8-F283-45AE-878A-BAB7291924A1}"/>
                               <w:text/>
                             </w:sdtPr>
+                            <w:sdtEndPr/>
                             <w:sdtContent>
                               <w:p>
                                 <w:pPr>
@@ -373,6 +365,7 @@
                                 <w:dataBinding w:prefixMappings="xmlns:ns0='http://schemas.openxmlformats.org/officeDocument/2006/extended-properties' " w:xpath="/ns0:Properties[1]/ns0:Company[1]" w:storeItemID="{6668398D-A668-4E3E-A5EB-62B293D839F1}"/>
                                 <w:text/>
                               </w:sdtPr>
+                              <w:sdtEndPr/>
                               <w:sdtContent>
                                 <w:r>
                                   <w:rPr>
@@ -400,6 +393,7 @@
                                 <w:dataBinding w:prefixMappings="xmlns:ns0='http://schemas.microsoft.com/office/2006/coverPageProps' " w:xpath="/ns0:CoverPageProperties[1]/ns0:CompanyAddress[1]" w:storeItemID="{55AF091B-3C7A-41E3-B477-F2FDAA23CFDA}"/>
                                 <w:text/>
                               </w:sdtPr>
+                              <w:sdtEndPr/>
                               <w:sdtContent>
                                 <w:r>
                                   <w:rPr>
@@ -445,19 +439,7 @@
                                 <w:szCs w:val="48"/>
                                 <w:shd w:val="clear" w:color="auto" w:fill="FFFFFF"/>
                               </w:rPr>
-                              <w:t xml:space="preserve">Actividad </w:t>
-                            </w:r>
-                            <w:r>
-                              <w:rPr>
-                                <w:rFonts w:ascii="Segoe UI" w:hAnsi="Segoe UI" w:cs="Segoe UI"/>
-                                <w:b/>
-                                <w:bCs/>
-                                <w:color w:val="F2891E"/>
-                                <w:sz w:val="48"/>
-                                <w:szCs w:val="48"/>
-                                <w:shd w:val="clear" w:color="auto" w:fill="FFFFFF"/>
-                              </w:rPr>
-                              <w:t>Industria 1.0</w:t>
+                              <w:t>Actividad Industria 1.0</w:t>
                             </w:r>
                           </w:p>
                         </w:txbxContent>
@@ -547,7 +529,7 @@
           <w:sz w:val="24"/>
           <w:szCs w:val="24"/>
         </w:rPr>
-        <w:t>La Revolución Industrial provocó una gran transformación en la forma de producir y de vivir. Permitió fabricar productos en mayores cantidades gracias a las nuevas máquinas y a las fábricas, aumentando la producción y haciendo que muchos productos fueran más accesibles</w:t>
+        <w:t xml:space="preserve">La Revolución Industrial </w:t>
       </w:r>
       <w:r>
         <w:rPr>
@@ -555,7 +537,95 @@
           <w:sz w:val="24"/>
           <w:szCs w:val="24"/>
         </w:rPr>
-        <w:t>.</w:t>
+        <w:t xml:space="preserve">tuvo efectos positivos en donde </w:t>
+      </w:r>
+      <w:r>
+        <w:rPr>
+          <w:rFonts w:ascii="Arial" w:hAnsi="Arial" w:cs="Arial"/>
+          <w:sz w:val="24"/>
+          <w:szCs w:val="24"/>
+        </w:rPr>
+        <w:t>provocó una gran transformación en la forma de producir y de vivir</w:t>
+      </w:r>
+      <w:r>
+        <w:rPr>
+          <w:rFonts w:ascii="Arial" w:hAnsi="Arial" w:cs="Arial"/>
+          <w:sz w:val="24"/>
+          <w:szCs w:val="24"/>
+        </w:rPr>
+        <w:t xml:space="preserve"> del humano</w:t>
+      </w:r>
+      <w:r>
+        <w:rPr>
+          <w:rFonts w:ascii="Arial" w:hAnsi="Arial" w:cs="Arial"/>
+          <w:sz w:val="24"/>
+          <w:szCs w:val="24"/>
+        </w:rPr>
+        <w:t xml:space="preserve">. </w:t>
+      </w:r>
+      <w:r>
+        <w:rPr>
+          <w:rFonts w:ascii="Arial" w:hAnsi="Arial" w:cs="Arial"/>
+          <w:sz w:val="24"/>
+          <w:szCs w:val="24"/>
+        </w:rPr>
+        <w:t>Nos p</w:t>
+      </w:r>
+      <w:r>
+        <w:rPr>
+          <w:rFonts w:ascii="Arial" w:hAnsi="Arial" w:cs="Arial"/>
+          <w:sz w:val="24"/>
+          <w:szCs w:val="24"/>
+        </w:rPr>
+        <w:t>ermitió fabricar productos en mayores cantidades gracias a las nuevas máquinas y a las fábricas</w:t>
+      </w:r>
+      <w:r>
+        <w:rPr>
+          <w:rFonts w:ascii="Arial" w:hAnsi="Arial" w:cs="Arial"/>
+          <w:sz w:val="24"/>
+          <w:szCs w:val="24"/>
+        </w:rPr>
+        <w:t xml:space="preserve">. De esta manera se consiguió </w:t>
+      </w:r>
+      <w:r>
+        <w:rPr>
+          <w:rFonts w:ascii="Arial" w:hAnsi="Arial" w:cs="Arial"/>
+          <w:sz w:val="24"/>
+          <w:szCs w:val="24"/>
+        </w:rPr>
+        <w:t>aumenta</w:t>
+      </w:r>
+      <w:r>
+        <w:rPr>
+          <w:rFonts w:ascii="Arial" w:hAnsi="Arial" w:cs="Arial"/>
+          <w:sz w:val="24"/>
+          <w:szCs w:val="24"/>
+        </w:rPr>
+        <w:t>r</w:t>
+      </w:r>
+      <w:r>
+        <w:rPr>
+          <w:rFonts w:ascii="Arial" w:hAnsi="Arial" w:cs="Arial"/>
+          <w:sz w:val="24"/>
+          <w:szCs w:val="24"/>
+        </w:rPr>
+        <w:t xml:space="preserve"> la producción </w:t>
+      </w:r>
+      <w:r>
+        <w:rPr>
+          <w:rFonts w:ascii="Arial" w:hAnsi="Arial" w:cs="Arial"/>
+          <w:sz w:val="24"/>
+          <w:szCs w:val="24"/>
+        </w:rPr>
+        <w:t>además de hacer</w:t>
+      </w:r>
+      <w:r>
+        <w:rPr>
+          <w:rFonts w:ascii="Arial" w:hAnsi="Arial" w:cs="Arial"/>
+          <w:sz w:val="24"/>
+          <w:szCs w:val="24"/>
+        </w:rPr>
+        <w:t xml:space="preserve"> que muchos productos fueran más accesibles.</w:t>
       </w:r>
     </w:p>
     <w:p>
@@ -573,7 +643,33 @@
           <w:sz w:val="24"/>
           <w:szCs w:val="24"/>
         </w:rPr>
-        <w:t>la Revolución Industrial dio lugar al mundo moderno basado en la producción industrial, el comercio, el consumo y el desarrollo de nuevas tecnologías.</w:t>
+        <w:t xml:space="preserve">Por el otro lado, tuvo consecuencias negativas como la eliminación de determinados puestos de trabajo manuales o las condiciones de trabajo en las fábricas. </w:t>
+      </w:r>
+    </w:p>
+    <w:p>
+      <w:pPr>
+        <w:jc w:val="both"/>
+        <w:rPr>
+          <w:rFonts w:ascii="Arial" w:hAnsi="Arial" w:cs="Arial"/>
+          <w:sz w:val="24"/>
+          <w:szCs w:val="24"/>
+        </w:rPr>
+      </w:pPr>
+      <w:r>
+        <w:rPr>
+          <w:rFonts w:ascii="Arial" w:hAnsi="Arial" w:cs="Arial"/>
+          <w:sz w:val="24"/>
+          <w:szCs w:val="24"/>
+        </w:rPr>
+        <w:t>En conclusión, la</w:t>
+      </w:r>
+      <w:r>
+        <w:rPr>
+          <w:rFonts w:ascii="Arial" w:hAnsi="Arial" w:cs="Arial"/>
+          <w:sz w:val="24"/>
+          <w:szCs w:val="24"/>
+        </w:rPr>
+        <w:t xml:space="preserve"> Revolución Industrial dio lugar al mundo moderno basado en la producción industrial, el comercio, el consumo y el desarrollo de nuevas tecnologías.</w:t>
       </w:r>
     </w:p>
     <w:sectPr>
@@ -625,6 +721,7 @@
         <w:docPartUnique/>
       </w:docPartObj>
     </w:sdtPr>
+    <w:sdtEndPr/>
     <w:sdtContent>
       <w:p>
         <w:pPr>
@@ -958,6 +1055,7 @@
                             <w:dataBinding w:prefixMappings="xmlns:ns0='http://purl.org/dc/elements/1.1/' xmlns:ns1='http://schemas.openxmlformats.org/package/2006/metadata/core-properties' " w:xpath="/ns1:coreProperties[1]/ns0:title[1]" w:storeItemID="{6C3C8BC8-F283-45AE-878A-BAB7291924A1}"/>
                             <w:text/>
                           </w:sdtPr>
+                          <w:sdtEndPr/>
                           <w:sdtContent>
                             <w:p>
                               <w:pPr>
@@ -1019,6 +1117,7 @@
                       <w:dataBinding w:prefixMappings="xmlns:ns0='http://purl.org/dc/elements/1.1/' xmlns:ns1='http://schemas.openxmlformats.org/package/2006/metadata/core-properties' " w:xpath="/ns1:coreProperties[1]/ns0:title[1]" w:storeItemID="{6C3C8BC8-F283-45AE-878A-BAB7291924A1}"/>
                       <w:text/>
                     </w:sdtPr>
+                    <w:sdtEndPr/>
                     <w:sdtContent>
                       <w:p>
                         <w:pPr>

</xml_diff>